<commit_message>
feat: przypisy dolne i koncowe w korekcie dokumentu (komentarz przy odnosniku - LibreOffice), bezplatna probka 2 stron z limitami naduzyc, lejek dokumentow w raporcie, opisy i regulamin
</commit_message>
<xml_diff>
--- a/backend/scripts/fixtures/praca-testowa.docx
+++ b/backend/scripts/fixtures/praca-testowa.docx
@@ -41,6 +41,12 @@
       <w:r>
         <w:t xml:space="preserve">Zespoły które pracują w różnych strefach czasowych muszą planować spotkania z wyprzedzeniem.</w:t>
       </w:r>
+      <w:r>
+        <w:rPr>
+          <w:vertAlign w:val="superscript"/>
+        </w:rPr>
+        <w:footnoteReference w:id="2"/>
+      </w:r>
     </w:p>
     <w:p>
       <w:r>
@@ -50,6 +56,12 @@
     <w:p>
       <w:r>
         <w:t xml:space="preserve">W badaniu sprawdzono czy częstotliwość spotkań wpływa na zadowolenie z pracy. Okazało się że wystarcza jedna krótka rozmowa w tygodniu.</w:t>
+      </w:r>
+      <w:r>
+        <w:rPr>
+          <w:vertAlign w:val="superscript"/>
+        </w:rPr>
+        <w:footnoteReference w:id="3"/>
       </w:r>
     </w:p>
     <w:p>
@@ -78,4 +90,49 @@
     </w:sectPr>
   </w:body>
 </w:document>
+</file>
+
+<file path=word/footnotes.xml><?xml version="1.0" encoding="utf-8"?>
+<w:footnotes xmlns:w="http://schemas.openxmlformats.org/wordprocessingml/2006/main">
+  <w:footnote w:type="separator" w:id="-1">
+    <w:p>
+      <w:r>
+        <w:separator/>
+      </w:r>
+    </w:p>
+  </w:footnote>
+  <w:footnote w:type="continuationSeparator" w:id="0">
+    <w:p>
+      <w:r>
+        <w:continuationSeparator/>
+      </w:r>
+    </w:p>
+  </w:footnote>
+  <w:footnote w:id="2">
+    <w:p>
+      <w:r>
+        <w:rPr>
+          <w:vertAlign w:val="superscript"/>
+        </w:rPr>
+        <w:footnoteRef/>
+      </w:r>
+      <w:r>
+        <w:t xml:space="preserve"> Warto dodać że w zespołach międzynarodowych problem ten jest jeszcze wyraźniejszy, bo dochodzą różnice kulturowe.</w:t>
+      </w:r>
+    </w:p>
+  </w:footnote>
+  <w:footnote w:id="3">
+    <w:p>
+      <w:r>
+        <w:rPr>
+          <w:vertAlign w:val="superscript"/>
+        </w:rPr>
+        <w:footnoteRef/>
+      </w:r>
+      <w:r>
+        <w:t xml:space="preserve"> Por. A. Kowalski, Komunikacja w organizacji ktora sie zmienia, Difin, Warszawa 2019, s. 112.</w:t>
+      </w:r>
+    </w:p>
+  </w:footnote>
+</w:footnotes>
 </file>
</xml_diff>